<commit_message>
Bounty 名誉榜机制 + DCO 暂缓 (CI core 146→147)
- 新增 bounty_leaderboard.md：交易台账 + 死规则计分（corpus+1/adversarial+2/defect confirmed+10）+ 反作弊（confirmed 缺陷必挂锚 ID）
- 新增 run_bounty_ledger_smoke.py：校验台账结构/得分一致性/锚引用 + 计算实时排名，防刷分与自证桩
- BOUNTY.md 补「名誉榜与计分」章节（现金暂缓，仅名誉榜，打款延后由人执行）
- 登记 CORE_SMOKES → CI core 146→147；README/MEMORY 计数同步
- 规划三件套 §6 回填：DCO 用户暂缓「先跨过」，bounty 名誉榜已建
- 计数门禁 OK（n_core=147）；bounty/spice/proposal 护栏全绿

注：DCO 轻量签署经用户确认暂缓，待后续再行评估。
</commit_message>
<xml_diff>
--- a/LDA_研发规划与实施计划_2026-09-09.docx
+++ b/LDA_研发规划与实施计划_2026-09-09.docx
@@ -4942,7 +4942,43 @@
           <w:i w:val="0"/>
           <w:sz w:val="20"/>
         </w:rPr>
-        <w:t>☐ （待拍板）加 DCO 轻量签署 + 单列 bounty 现金池。</w:t>
+        <w:t>☑ Bounty 名誉榜机制（DCO 用户暂缓「先跨过」）。【</w:t>
+      </w:r>
+      <w:r>
+        <w:rPr>
+          <w:rFonts w:ascii="Consolas" w:hAnsi="Consolas" w:eastAsia="宋体"/>
+          <w:b w:val="0"/>
+          <w:i w:val="0"/>
+          <w:sz w:val="20"/>
+        </w:rPr>
+        <w:t>bounty_leaderboard.md</w:t>
+      </w:r>
+      <w:r>
+        <w:rPr>
+          <w:rFonts w:ascii="Calibri" w:hAnsi="Calibri" w:eastAsia="宋体"/>
+          <w:b w:val="0"/>
+          <w:i w:val="0"/>
+          <w:sz w:val="20"/>
+        </w:rPr>
+        <w:t xml:space="preserve"> 台账 + 计分死规则 + 反作弊（confirmed 缺陷必挂锚） + </w:t>
+      </w:r>
+      <w:r>
+        <w:rPr>
+          <w:rFonts w:ascii="Consolas" w:hAnsi="Consolas" w:eastAsia="宋体"/>
+          <w:b w:val="0"/>
+          <w:i w:val="0"/>
+          <w:sz w:val="20"/>
+        </w:rPr>
+        <w:t>run_bounty_ledger_smoke</w:t>
+      </w:r>
+      <w:r>
+        <w:rPr>
+          <w:rFonts w:ascii="Calibri" w:hAnsi="Calibri" w:eastAsia="宋体"/>
+          <w:b w:val="0"/>
+          <w:i w:val="0"/>
+          <w:sz w:val="20"/>
+        </w:rPr>
+        <w:t xml:space="preserve"> 进 CORE（CI 146→147）；现金奖励暂缓，仅名誉榜，打款延后由人执行】</w:t>
       </w:r>
     </w:p>
     <w:p>

</xml_diff>